<commit_message>
Actualización SEM22 — reportes ejecutivos validados
</commit_message>
<xml_diff>
--- a/Reportes Claude.docx
+++ b/Reportes Claude.docx
@@ -4,74 +4,45 @@
   <w:body>
     <w:p>
       <w:pPr>
-        <w:spacing w:before="100" w:beforeAutospacing="1" w:after="100" w:afterAutospacing="1" w:line="240" w:lineRule="auto"/>
+        <w:spacing w:before="100" w:beforeAutospacing="1" w:after="100" w:afterAutospacing="1"/>
         <w:outlineLvl w:val="2"/>
         <w:rPr>
-          <w:rFonts w:ascii="Times New Roman" w:eastAsia="Times New Roman" w:hAnsi="Times New Roman" w:cs="Times New Roman"/>
           <w:b/>
           <w:bCs/>
-          <w:kern w:val="0"/>
           <w:sz w:val="27"/>
           <w:szCs w:val="27"/>
-          <w14:ligatures w14:val="none"/>
-        </w:rPr>
-      </w:pPr>
-      <w:r>
-        <w:rPr>
-          <w:rFonts w:ascii="Times New Roman" w:eastAsia="Times New Roman" w:hAnsi="Times New Roman" w:cs="Times New Roman"/>
+        </w:rPr>
+      </w:pPr>
+      <w:r>
+        <w:rPr>
           <w:b/>
           <w:bCs/>
-          <w:kern w:val="0"/>
           <w:sz w:val="27"/>
           <w:szCs w:val="27"/>
-          <w14:ligatures w14:val="none"/>
         </w:rPr>
         <w:t>Rutina semanal — Actualización de reportes ejecutivos</w:t>
       </w:r>
     </w:p>
     <w:p>
       <w:pPr>
-        <w:spacing w:before="100" w:beforeAutospacing="1" w:after="100" w:afterAutospacing="1" w:line="240" w:lineRule="auto"/>
-        <w:rPr>
-          <w:rFonts w:ascii="Times New Roman" w:eastAsia="Times New Roman" w:hAnsi="Times New Roman" w:cs="Times New Roman"/>
-          <w:kern w:val="0"/>
-          <w14:ligatures w14:val="none"/>
-        </w:rPr>
-      </w:pPr>
-      <w:r>
-        <w:rPr>
-          <w:rFonts w:ascii="Times New Roman" w:eastAsia="Times New Roman" w:hAnsi="Times New Roman" w:cs="Times New Roman"/>
-          <w:kern w:val="0"/>
-          <w14:ligatures w14:val="none"/>
-        </w:rPr>
+        <w:spacing w:before="100" w:beforeAutospacing="1" w:after="100" w:afterAutospacing="1"/>
+      </w:pPr>
+      <w:r>
         <w:t>Cada lunes haces lo siguiente:</w:t>
       </w:r>
     </w:p>
     <w:p>
       <w:pPr>
-        <w:spacing w:before="100" w:beforeAutospacing="1" w:after="100" w:afterAutospacing="1" w:line="240" w:lineRule="auto"/>
-        <w:rPr>
-          <w:rFonts w:ascii="Times New Roman" w:eastAsia="Times New Roman" w:hAnsi="Times New Roman" w:cs="Times New Roman"/>
-          <w:kern w:val="0"/>
-          <w14:ligatures w14:val="none"/>
-        </w:rPr>
-      </w:pPr>
-      <w:r>
-        <w:rPr>
-          <w:rFonts w:ascii="Times New Roman" w:eastAsia="Times New Roman" w:hAnsi="Times New Roman" w:cs="Times New Roman"/>
+        <w:spacing w:before="100" w:beforeAutospacing="1" w:after="100" w:afterAutospacing="1"/>
+      </w:pPr>
+      <w:r>
+        <w:rPr>
           <w:b/>
           <w:bCs/>
-          <w:kern w:val="0"/>
-          <w14:ligatures w14:val="none"/>
         </w:rPr>
         <w:t>1. Actualiza los 4 archivos Excel</w:t>
       </w:r>
       <w:r>
-        <w:rPr>
-          <w:rFonts w:ascii="Times New Roman" w:eastAsia="Times New Roman" w:hAnsi="Times New Roman" w:cs="Times New Roman"/>
-          <w:kern w:val="0"/>
-          <w14:ligatures w14:val="none"/>
-        </w:rPr>
         <w:t xml:space="preserve"> con los datos de la semana nueva y guárdalos en la carpeta REPORTES JOCELYN:</w:t>
       </w:r>
     </w:p>
@@ -81,20 +52,13 @@
           <w:ilvl w:val="0"/>
           <w:numId w:val="1"/>
         </w:numPr>
-        <w:spacing w:before="100" w:beforeAutospacing="1" w:after="100" w:afterAutospacing="1" w:line="240" w:lineRule="auto"/>
-        <w:rPr>
-          <w:rFonts w:ascii="Times New Roman" w:eastAsia="Times New Roman" w:hAnsi="Times New Roman" w:cs="Times New Roman"/>
-          <w:kern w:val="0"/>
-          <w14:ligatures w14:val="none"/>
-        </w:rPr>
-      </w:pPr>
-      <w:r>
-        <w:rPr>
-          <w:rFonts w:ascii="Courier New" w:eastAsia="Times New Roman" w:hAnsi="Courier New" w:cs="Courier New"/>
-          <w:kern w:val="0"/>
+        <w:spacing w:before="100" w:beforeAutospacing="1" w:after="100" w:afterAutospacing="1"/>
+      </w:pPr>
+      <w:r>
+        <w:rPr>
+          <w:rFonts w:ascii="Courier New" w:hAnsi="Courier New" w:cs="Courier New"/>
           <w:sz w:val="20"/>
           <w:szCs w:val="20"/>
-          <w14:ligatures w14:val="none"/>
         </w:rPr>
         <w:t>VENTAS SHEIN 2026.xlsx</w:t>
       </w:r>
@@ -105,20 +69,13 @@
           <w:ilvl w:val="0"/>
           <w:numId w:val="1"/>
         </w:numPr>
-        <w:spacing w:before="100" w:beforeAutospacing="1" w:after="100" w:afterAutospacing="1" w:line="240" w:lineRule="auto"/>
-        <w:rPr>
-          <w:rFonts w:ascii="Times New Roman" w:eastAsia="Times New Roman" w:hAnsi="Times New Roman" w:cs="Times New Roman"/>
-          <w:kern w:val="0"/>
-          <w14:ligatures w14:val="none"/>
-        </w:rPr>
-      </w:pPr>
-      <w:r>
-        <w:rPr>
-          <w:rFonts w:ascii="Courier New" w:eastAsia="Times New Roman" w:hAnsi="Courier New" w:cs="Courier New"/>
-          <w:kern w:val="0"/>
+        <w:spacing w:before="100" w:beforeAutospacing="1" w:after="100" w:afterAutospacing="1"/>
+      </w:pPr>
+      <w:r>
+        <w:rPr>
+          <w:rFonts w:ascii="Courier New" w:hAnsi="Courier New" w:cs="Courier New"/>
           <w:sz w:val="20"/>
           <w:szCs w:val="20"/>
-          <w14:ligatures w14:val="none"/>
         </w:rPr>
         <w:t>VENTAS AMAZON 2026.xlsx</w:t>
       </w:r>
@@ -129,20 +86,13 @@
           <w:ilvl w:val="0"/>
           <w:numId w:val="1"/>
         </w:numPr>
-        <w:spacing w:before="100" w:beforeAutospacing="1" w:after="100" w:afterAutospacing="1" w:line="240" w:lineRule="auto"/>
-        <w:rPr>
-          <w:rFonts w:ascii="Times New Roman" w:eastAsia="Times New Roman" w:hAnsi="Times New Roman" w:cs="Times New Roman"/>
-          <w:kern w:val="0"/>
-          <w14:ligatures w14:val="none"/>
-        </w:rPr>
-      </w:pPr>
-      <w:r>
-        <w:rPr>
-          <w:rFonts w:ascii="Courier New" w:eastAsia="Times New Roman" w:hAnsi="Courier New" w:cs="Courier New"/>
-          <w:kern w:val="0"/>
+        <w:spacing w:before="100" w:beforeAutospacing="1" w:after="100" w:afterAutospacing="1"/>
+      </w:pPr>
+      <w:r>
+        <w:rPr>
+          <w:rFonts w:ascii="Courier New" w:hAnsi="Courier New" w:cs="Courier New"/>
           <w:sz w:val="20"/>
           <w:szCs w:val="20"/>
-          <w14:ligatures w14:val="none"/>
         </w:rPr>
         <w:t>VENTAS ML 2026.xlsx</w:t>
       </w:r>
@@ -153,169 +103,97 @@
           <w:ilvl w:val="0"/>
           <w:numId w:val="1"/>
         </w:numPr>
-        <w:spacing w:before="100" w:beforeAutospacing="1" w:after="100" w:afterAutospacing="1" w:line="240" w:lineRule="auto"/>
-        <w:rPr>
-          <w:rFonts w:ascii="Times New Roman" w:eastAsia="Times New Roman" w:hAnsi="Times New Roman" w:cs="Times New Roman"/>
-          <w:kern w:val="0"/>
-          <w14:ligatures w14:val="none"/>
-        </w:rPr>
-      </w:pPr>
-      <w:r>
-        <w:rPr>
-          <w:rFonts w:ascii="Courier New" w:eastAsia="Times New Roman" w:hAnsi="Courier New" w:cs="Courier New"/>
-          <w:kern w:val="0"/>
+        <w:spacing w:before="100" w:beforeAutospacing="1" w:after="100" w:afterAutospacing="1"/>
+      </w:pPr>
+      <w:r>
+        <w:rPr>
+          <w:rFonts w:ascii="Courier New" w:hAnsi="Courier New" w:cs="Courier New"/>
           <w:sz w:val="20"/>
           <w:szCs w:val="20"/>
-          <w14:ligatures w14:val="none"/>
         </w:rPr>
         <w:t>VENTAS WEB + TT 2026.xlsx</w:t>
       </w:r>
     </w:p>
     <w:p>
       <w:pPr>
-        <w:spacing w:before="100" w:beforeAutospacing="1" w:after="100" w:afterAutospacing="1" w:line="240" w:lineRule="auto"/>
-        <w:rPr>
-          <w:rFonts w:ascii="Times New Roman" w:eastAsia="Times New Roman" w:hAnsi="Times New Roman" w:cs="Times New Roman"/>
-          <w:kern w:val="0"/>
-          <w14:ligatures w14:val="none"/>
-        </w:rPr>
-      </w:pPr>
-      <w:r>
-        <w:rPr>
-          <w:rFonts w:ascii="Times New Roman" w:eastAsia="Times New Roman" w:hAnsi="Times New Roman" w:cs="Times New Roman"/>
+        <w:spacing w:before="100" w:beforeAutospacing="1" w:after="100" w:afterAutospacing="1"/>
+      </w:pPr>
+      <w:r>
+        <w:rPr>
           <w:b/>
           <w:bCs/>
-          <w:kern w:val="0"/>
-          <w14:ligatures w14:val="none"/>
         </w:rPr>
         <w:t>2. Abre una sesión nueva en Claude (Cowork)</w:t>
       </w:r>
       <w:r>
-        <w:rPr>
-          <w:rFonts w:ascii="Times New Roman" w:eastAsia="Times New Roman" w:hAnsi="Times New Roman" w:cs="Times New Roman"/>
-          <w:kern w:val="0"/>
-          <w14:ligatures w14:val="none"/>
-        </w:rPr>
         <w:t xml:space="preserve"> y dile exactamente esto:</w:t>
       </w:r>
     </w:p>
     <w:p>
       <w:pPr>
-        <w:spacing w:before="100" w:beforeAutospacing="1" w:after="100" w:afterAutospacing="1" w:line="240" w:lineRule="auto"/>
-        <w:rPr>
-          <w:rFonts w:ascii="Times New Roman" w:eastAsia="Times New Roman" w:hAnsi="Times New Roman" w:cs="Times New Roman"/>
-          <w:kern w:val="0"/>
-          <w14:ligatures w14:val="none"/>
-        </w:rPr>
-      </w:pPr>
-      <w:r>
-        <w:rPr>
-          <w:rFonts w:ascii="Times New Roman" w:eastAsia="Times New Roman" w:hAnsi="Times New Roman" w:cs="Times New Roman"/>
+        <w:spacing w:before="100" w:beforeAutospacing="1" w:after="100" w:afterAutospacing="1"/>
+      </w:pPr>
+      <w:r>
+        <w:rPr>
           <w:i/>
           <w:iCs/>
-          <w:kern w:val="0"/>
-          <w14:ligatures w14:val="none"/>
         </w:rPr>
         <w:t>"Vamos a actualizar los reportes ejecutivos semanales. Los Excel ya están actualizados en la carpeta REPORTES JOCELYN. Por favor lee el CLAUDE.md y la memoria del proyecto, extrae los datos nuevos de cada plataforma y actualiza los 6 reportes HTML."</w:t>
       </w:r>
     </w:p>
     <w:p>
       <w:pPr>
-        <w:spacing w:before="100" w:beforeAutospacing="1" w:after="100" w:afterAutospacing="1" w:line="240" w:lineRule="auto"/>
-        <w:rPr>
-          <w:rFonts w:ascii="Times New Roman" w:eastAsia="Times New Roman" w:hAnsi="Times New Roman" w:cs="Times New Roman"/>
-          <w:kern w:val="0"/>
-          <w14:ligatures w14:val="none"/>
-        </w:rPr>
-      </w:pPr>
-      <w:r>
-        <w:rPr>
-          <w:rFonts w:ascii="Times New Roman" w:eastAsia="Times New Roman" w:hAnsi="Times New Roman" w:cs="Times New Roman"/>
-          <w:kern w:val="0"/>
-          <w14:ligatures w14:val="none"/>
-        </w:rPr>
+        <w:spacing w:before="100" w:beforeAutospacing="1" w:after="100" w:afterAutospacing="1"/>
+      </w:pPr>
+      <w:r>
         <w:t>Claude sabrá qué hacer porque toda la documentación ya está guardada en la carpeta (</w:t>
       </w:r>
       <w:r>
         <w:rPr>
-          <w:rFonts w:ascii="Courier New" w:eastAsia="Times New Roman" w:hAnsi="Courier New" w:cs="Courier New"/>
-          <w:kern w:val="0"/>
+          <w:rFonts w:ascii="Courier New" w:hAnsi="Courier New" w:cs="Courier New"/>
           <w:sz w:val="20"/>
           <w:szCs w:val="20"/>
-          <w14:ligatures w14:val="none"/>
         </w:rPr>
         <w:t>CLAUDE.md</w:t>
       </w:r>
       <w:r>
-        <w:rPr>
-          <w:rFonts w:ascii="Times New Roman" w:eastAsia="Times New Roman" w:hAnsi="Times New Roman" w:cs="Times New Roman"/>
-          <w:kern w:val="0"/>
-          <w14:ligatures w14:val="none"/>
-        </w:rPr>
         <w:t xml:space="preserve">, </w:t>
       </w:r>
       <w:r>
         <w:rPr>
-          <w:rFonts w:ascii="Courier New" w:eastAsia="Times New Roman" w:hAnsi="Courier New" w:cs="Courier New"/>
-          <w:kern w:val="0"/>
+          <w:rFonts w:ascii="Courier New" w:hAnsi="Courier New" w:cs="Courier New"/>
           <w:sz w:val="20"/>
           <w:szCs w:val="20"/>
-          <w14:ligatures w14:val="none"/>
         </w:rPr>
         <w:t>memory/projects/reportes-ejecutivos.md</w:t>
       </w:r>
       <w:r>
-        <w:rPr>
-          <w:rFonts w:ascii="Times New Roman" w:eastAsia="Times New Roman" w:hAnsi="Times New Roman" w:cs="Times New Roman"/>
-          <w:kern w:val="0"/>
-          <w14:ligatures w14:val="none"/>
-        </w:rPr>
         <w:t xml:space="preserve">, </w:t>
       </w:r>
       <w:r>
         <w:rPr>
-          <w:rFonts w:ascii="Courier New" w:eastAsia="Times New Roman" w:hAnsi="Courier New" w:cs="Courier New"/>
-          <w:kern w:val="0"/>
+          <w:rFonts w:ascii="Courier New" w:hAnsi="Courier New" w:cs="Courier New"/>
           <w:sz w:val="20"/>
           <w:szCs w:val="20"/>
-          <w14:ligatures w14:val="none"/>
         </w:rPr>
         <w:t>memory/projects/rutina-lunes.md</w:t>
       </w:r>
       <w:r>
-        <w:rPr>
-          <w:rFonts w:ascii="Times New Roman" w:eastAsia="Times New Roman" w:hAnsi="Times New Roman" w:cs="Times New Roman"/>
-          <w:kern w:val="0"/>
-          <w14:ligatures w14:val="none"/>
-        </w:rPr>
         <w:t>).</w:t>
       </w:r>
     </w:p>
     <w:p>
       <w:pPr>
-        <w:spacing w:before="100" w:beforeAutospacing="1" w:after="100" w:afterAutospacing="1" w:line="240" w:lineRule="auto"/>
-        <w:rPr>
-          <w:rFonts w:ascii="Times New Roman" w:eastAsia="Times New Roman" w:hAnsi="Times New Roman" w:cs="Times New Roman"/>
-          <w:kern w:val="0"/>
-          <w14:ligatures w14:val="none"/>
-        </w:rPr>
-      </w:pPr>
-      <w:r>
-        <w:rPr>
-          <w:rFonts w:ascii="Times New Roman" w:eastAsia="Times New Roman" w:hAnsi="Times New Roman" w:cs="Times New Roman"/>
+        <w:spacing w:before="100" w:beforeAutospacing="1" w:after="100" w:afterAutospacing="1"/>
+      </w:pPr>
+      <w:r>
+        <w:rPr>
           <w:b/>
           <w:bCs/>
-          <w:kern w:val="0"/>
-          <w14:ligatures w14:val="none"/>
         </w:rPr>
         <w:t>3. Revisa visualmente</w:t>
       </w:r>
       <w:r>
-        <w:rPr>
-          <w:rFonts w:ascii="Times New Roman" w:eastAsia="Times New Roman" w:hAnsi="Times New Roman" w:cs="Times New Roman"/>
-          <w:kern w:val="0"/>
-          <w14:ligatures w14:val="none"/>
-        </w:rPr>
         <w:t xml:space="preserve"> los 6 reportes cuando Claude los entregue, prestando atención a:</w:t>
       </w:r>
     </w:p>
@@ -325,19 +203,9 @@
           <w:ilvl w:val="0"/>
           <w:numId w:val="2"/>
         </w:numPr>
-        <w:spacing w:before="100" w:beforeAutospacing="1" w:after="100" w:afterAutospacing="1" w:line="240" w:lineRule="auto"/>
-        <w:rPr>
-          <w:rFonts w:ascii="Times New Roman" w:eastAsia="Times New Roman" w:hAnsi="Times New Roman" w:cs="Times New Roman"/>
-          <w:kern w:val="0"/>
-          <w14:ligatures w14:val="none"/>
-        </w:rPr>
-      </w:pPr>
-      <w:r>
-        <w:rPr>
-          <w:rFonts w:ascii="Times New Roman" w:eastAsia="Times New Roman" w:hAnsi="Times New Roman" w:cs="Times New Roman"/>
-          <w:kern w:val="0"/>
-          <w14:ligatures w14:val="none"/>
-        </w:rPr>
+        <w:spacing w:before="100" w:beforeAutospacing="1" w:after="100" w:afterAutospacing="1"/>
+      </w:pPr>
+      <w:r>
         <w:t>Que aparezca la semana nueva en las gráficas de barras</w:t>
       </w:r>
     </w:p>
@@ -347,19 +215,9 @@
           <w:ilvl w:val="0"/>
           <w:numId w:val="2"/>
         </w:numPr>
-        <w:spacing w:before="100" w:beforeAutospacing="1" w:after="100" w:afterAutospacing="1" w:line="240" w:lineRule="auto"/>
-        <w:rPr>
-          <w:rFonts w:ascii="Times New Roman" w:eastAsia="Times New Roman" w:hAnsi="Times New Roman" w:cs="Times New Roman"/>
-          <w:kern w:val="0"/>
-          <w14:ligatures w14:val="none"/>
-        </w:rPr>
-      </w:pPr>
-      <w:r>
-        <w:rPr>
-          <w:rFonts w:ascii="Times New Roman" w:eastAsia="Times New Roman" w:hAnsi="Times New Roman" w:cs="Times New Roman"/>
-          <w:kern w:val="0"/>
-          <w14:ligatures w14:val="none"/>
-        </w:rPr>
+        <w:spacing w:before="100" w:beforeAutospacing="1" w:after="100" w:afterAutospacing="1"/>
+      </w:pPr>
+      <w:r>
         <w:t>Que los totales de la tabla resumen cuadren</w:t>
       </w:r>
     </w:p>
@@ -369,38 +227,20 @@
           <w:ilvl w:val="0"/>
           <w:numId w:val="2"/>
         </w:numPr>
-        <w:spacing w:before="100" w:beforeAutospacing="1" w:after="100" w:afterAutospacing="1" w:line="240" w:lineRule="auto"/>
-        <w:rPr>
-          <w:rFonts w:ascii="Times New Roman" w:eastAsia="Times New Roman" w:hAnsi="Times New Roman" w:cs="Times New Roman"/>
-          <w:kern w:val="0"/>
-          <w14:ligatures w14:val="none"/>
-        </w:rPr>
-      </w:pPr>
-      <w:r>
-        <w:rPr>
-          <w:rFonts w:ascii="Times New Roman" w:eastAsia="Times New Roman" w:hAnsi="Times New Roman" w:cs="Times New Roman"/>
-          <w:kern w:val="0"/>
-          <w14:ligatures w14:val="none"/>
-        </w:rPr>
+        <w:spacing w:before="100" w:beforeAutospacing="1" w:after="100" w:afterAutospacing="1"/>
+      </w:pPr>
+      <w:r>
         <w:t>Que el MoM y YoY se vean coherentes con la tendencia</w:t>
       </w:r>
     </w:p>
     <w:p>
       <w:pPr>
-        <w:spacing w:before="100" w:beforeAutospacing="1" w:after="100" w:afterAutospacing="1" w:line="240" w:lineRule="auto"/>
-        <w:rPr>
-          <w:rFonts w:ascii="Times New Roman" w:eastAsia="Times New Roman" w:hAnsi="Times New Roman" w:cs="Times New Roman"/>
-          <w:kern w:val="0"/>
-          <w14:ligatures w14:val="none"/>
-        </w:rPr>
-      </w:pPr>
-      <w:r>
-        <w:rPr>
-          <w:rFonts w:ascii="Times New Roman" w:eastAsia="Times New Roman" w:hAnsi="Times New Roman" w:cs="Times New Roman"/>
+        <w:spacing w:before="100" w:beforeAutospacing="1" w:after="100" w:afterAutospacing="1"/>
+      </w:pPr>
+      <w:r>
+        <w:rPr>
           <w:b/>
           <w:bCs/>
-          <w:kern w:val="0"/>
-          <w14:ligatures w14:val="none"/>
         </w:rPr>
         <w:t>Lo que Claude hará automáticamente cada semana:</w:t>
       </w:r>
@@ -411,19 +251,9 @@
           <w:ilvl w:val="0"/>
           <w:numId w:val="3"/>
         </w:numPr>
-        <w:spacing w:before="100" w:beforeAutospacing="1" w:after="100" w:afterAutospacing="1" w:line="240" w:lineRule="auto"/>
-        <w:rPr>
-          <w:rFonts w:ascii="Times New Roman" w:eastAsia="Times New Roman" w:hAnsi="Times New Roman" w:cs="Times New Roman"/>
-          <w:kern w:val="0"/>
-          <w14:ligatures w14:val="none"/>
-        </w:rPr>
-      </w:pPr>
-      <w:r>
-        <w:rPr>
-          <w:rFonts w:ascii="Times New Roman" w:eastAsia="Times New Roman" w:hAnsi="Times New Roman" w:cs="Times New Roman"/>
-          <w:kern w:val="0"/>
-          <w14:ligatures w14:val="none"/>
-        </w:rPr>
+        <w:spacing w:before="100" w:beforeAutospacing="1" w:after="100" w:afterAutospacing="1"/>
+      </w:pPr>
+      <w:r>
         <w:t>Leer las pestañas correctas de cada Excel (TABLAS, VENTAS, TABLAS WEB, TABLAS TIKTOK)</w:t>
       </w:r>
     </w:p>
@@ -433,55 +263,31 @@
           <w:ilvl w:val="0"/>
           <w:numId w:val="3"/>
         </w:numPr>
-        <w:spacing w:before="100" w:beforeAutospacing="1" w:after="100" w:afterAutospacing="1" w:line="240" w:lineRule="auto"/>
-        <w:rPr>
-          <w:rFonts w:ascii="Times New Roman" w:eastAsia="Times New Roman" w:hAnsi="Times New Roman" w:cs="Times New Roman"/>
-          <w:kern w:val="0"/>
-          <w14:ligatures w14:val="none"/>
-        </w:rPr>
-      </w:pPr>
-      <w:r>
-        <w:rPr>
-          <w:rFonts w:ascii="Times New Roman" w:eastAsia="Times New Roman" w:hAnsi="Times New Roman" w:cs="Times New Roman"/>
-          <w:kern w:val="0"/>
-          <w14:ligatures w14:val="none"/>
-        </w:rPr>
+        <w:spacing w:before="100" w:beforeAutospacing="1" w:after="100" w:afterAutospacing="1"/>
+      </w:pPr>
+      <w:r>
         <w:t xml:space="preserve">Agregar la nueva SEM al array </w:t>
       </w:r>
       <w:r>
         <w:rPr>
-          <w:rFonts w:ascii="Courier New" w:eastAsia="Times New Roman" w:hAnsi="Courier New" w:cs="Courier New"/>
-          <w:kern w:val="0"/>
+          <w:rFonts w:ascii="Courier New" w:hAnsi="Courier New" w:cs="Courier New"/>
           <w:sz w:val="20"/>
           <w:szCs w:val="20"/>
-          <w14:ligatures w14:val="none"/>
         </w:rPr>
         <w:t>SEM_V</w:t>
       </w:r>
       <w:r>
-        <w:rPr>
-          <w:rFonts w:ascii="Times New Roman" w:eastAsia="Times New Roman" w:hAnsi="Times New Roman" w:cs="Times New Roman"/>
-          <w:kern w:val="0"/>
-          <w14:ligatures w14:val="none"/>
-        </w:rPr>
         <w:t xml:space="preserve"> y </w:t>
       </w:r>
       <w:r>
         <w:rPr>
-          <w:rFonts w:ascii="Courier New" w:eastAsia="Times New Roman" w:hAnsi="Courier New" w:cs="Courier New"/>
-          <w:kern w:val="0"/>
+          <w:rFonts w:ascii="Courier New" w:hAnsi="Courier New" w:cs="Courier New"/>
           <w:sz w:val="20"/>
           <w:szCs w:val="20"/>
-          <w14:ligatures w14:val="none"/>
         </w:rPr>
         <w:t>SEM_P</w:t>
       </w:r>
       <w:r>
-        <w:rPr>
-          <w:rFonts w:ascii="Times New Roman" w:eastAsia="Times New Roman" w:hAnsi="Times New Roman" w:cs="Times New Roman"/>
-          <w:kern w:val="0"/>
-          <w14:ligatures w14:val="none"/>
-        </w:rPr>
         <w:t xml:space="preserve"> de cada reporte</w:t>
       </w:r>
     </w:p>
@@ -491,19 +297,9 @@
           <w:ilvl w:val="0"/>
           <w:numId w:val="3"/>
         </w:numPr>
-        <w:spacing w:before="100" w:beforeAutospacing="1" w:after="100" w:afterAutospacing="1" w:line="240" w:lineRule="auto"/>
-        <w:rPr>
-          <w:rFonts w:ascii="Times New Roman" w:eastAsia="Times New Roman" w:hAnsi="Times New Roman" w:cs="Times New Roman"/>
-          <w:kern w:val="0"/>
-          <w14:ligatures w14:val="none"/>
-        </w:rPr>
-      </w:pPr>
-      <w:r>
-        <w:rPr>
-          <w:rFonts w:ascii="Times New Roman" w:eastAsia="Times New Roman" w:hAnsi="Times New Roman" w:cs="Times New Roman"/>
-          <w:kern w:val="0"/>
-          <w14:ligatures w14:val="none"/>
-        </w:rPr>
+        <w:spacing w:before="100" w:beforeAutospacing="1" w:after="100" w:afterAutospacing="1"/>
+      </w:pPr>
+      <w:r>
         <w:t>Recalcular MoM, YoY y KPI pills</w:t>
       </w:r>
     </w:p>
@@ -513,19 +309,9 @@
           <w:ilvl w:val="0"/>
           <w:numId w:val="3"/>
         </w:numPr>
-        <w:spacing w:before="100" w:beforeAutospacing="1" w:after="100" w:afterAutospacing="1" w:line="240" w:lineRule="auto"/>
-        <w:rPr>
-          <w:rFonts w:ascii="Times New Roman" w:eastAsia="Times New Roman" w:hAnsi="Times New Roman" w:cs="Times New Roman"/>
-          <w:kern w:val="0"/>
-          <w14:ligatures w14:val="none"/>
-        </w:rPr>
-      </w:pPr>
-      <w:r>
-        <w:rPr>
-          <w:rFonts w:ascii="Times New Roman" w:eastAsia="Times New Roman" w:hAnsi="Times New Roman" w:cs="Times New Roman"/>
-          <w:kern w:val="0"/>
-          <w14:ligatures w14:val="none"/>
-        </w:rPr>
+        <w:spacing w:before="100" w:beforeAutospacing="1" w:after="100" w:afterAutospacing="1"/>
+      </w:pPr>
+      <w:r>
         <w:t>Actualizar el PLAT array del global</w:t>
       </w:r>
     </w:p>
@@ -535,85 +321,112 @@
           <w:ilvl w:val="0"/>
           <w:numId w:val="3"/>
         </w:numPr>
-        <w:spacing w:before="100" w:beforeAutospacing="1" w:after="100" w:afterAutospacing="1" w:line="240" w:lineRule="auto"/>
-        <w:rPr>
-          <w:rFonts w:ascii="Times New Roman" w:eastAsia="Times New Roman" w:hAnsi="Times New Roman" w:cs="Times New Roman"/>
-          <w:kern w:val="0"/>
-          <w14:ligatures w14:val="none"/>
-        </w:rPr>
-      </w:pPr>
-      <w:r>
-        <w:rPr>
-          <w:rFonts w:ascii="Times New Roman" w:eastAsia="Times New Roman" w:hAnsi="Times New Roman" w:cs="Times New Roman"/>
-          <w:kern w:val="0"/>
-          <w14:ligatures w14:val="none"/>
-        </w:rPr>
+        <w:spacing w:before="100" w:beforeAutospacing="1" w:after="100" w:afterAutospacing="1"/>
+      </w:pPr>
+      <w:r>
         <w:t>Actualizar el archivo de memoria con los nuevos datos validados</w:t>
       </w:r>
     </w:p>
     <w:p>
       <w:pPr>
-        <w:spacing w:before="100" w:beforeAutospacing="1" w:after="100" w:afterAutospacing="1" w:line="240" w:lineRule="auto"/>
-        <w:rPr>
-          <w:rFonts w:ascii="Times New Roman" w:eastAsia="Times New Roman" w:hAnsi="Times New Roman" w:cs="Times New Roman"/>
-          <w:kern w:val="0"/>
-          <w14:ligatures w14:val="none"/>
-        </w:rPr>
-      </w:pPr>
-      <w:r>
-        <w:rPr>
-          <w:rFonts w:ascii="Times New Roman" w:eastAsia="Times New Roman" w:hAnsi="Times New Roman" w:cs="Times New Roman"/>
+        <w:spacing w:before="100" w:beforeAutospacing="1" w:after="100" w:afterAutospacing="1"/>
+      </w:pPr>
+      <w:r>
+        <w:rPr>
           <w:b/>
           <w:bCs/>
-          <w:kern w:val="0"/>
-          <w14:ligatures w14:val="none"/>
         </w:rPr>
         <w:t>Cuando empiece un mes nuevo (ej. Junio):</w:t>
       </w:r>
       <w:r>
-        <w:rPr>
-          <w:rFonts w:ascii="Times New Roman" w:eastAsia="Times New Roman" w:hAnsi="Times New Roman" w:cs="Times New Roman"/>
-          <w:kern w:val="0"/>
-          <w14:ligatures w14:val="none"/>
-        </w:rPr>
         <w:t xml:space="preserve"> avísale a Claude que hay un mes nuevo para que rote los colores (el mes anterior pasa de morado </w:t>
       </w:r>
       <w:r>
         <w:rPr>
-          <w:rFonts w:ascii="Courier New" w:eastAsia="Times New Roman" w:hAnsi="Courier New" w:cs="Courier New"/>
-          <w:kern w:val="0"/>
+          <w:rFonts w:ascii="Courier New" w:hAnsi="Courier New" w:cs="Courier New"/>
           <w:sz w:val="20"/>
           <w:szCs w:val="20"/>
-          <w14:ligatures w14:val="none"/>
         </w:rPr>
         <w:t>#9333ea</w:t>
       </w:r>
       <w:r>
-        <w:rPr>
-          <w:rFonts w:ascii="Times New Roman" w:eastAsia="Times New Roman" w:hAnsi="Times New Roman" w:cs="Times New Roman"/>
-          <w:kern w:val="0"/>
-          <w14:ligatures w14:val="none"/>
-        </w:rPr>
         <w:t xml:space="preserve"> al color de la plataforma, y el mes nuevo toma el morado).</w:t>
       </w:r>
     </w:p>
     <w:p>
-      <w:pPr>
-        <w:rPr>
-          <w:rFonts w:ascii="Times New Roman" w:eastAsia="Times New Roman" w:hAnsi="Times New Roman" w:cs="Times New Roman"/>
-          <w:kern w:val="0"/>
-          <w14:ligatures w14:val="none"/>
-        </w:rPr>
-      </w:pPr>
-      <w:r>
-        <w:rPr>
-          <w:rFonts w:ascii="Times New Roman" w:eastAsia="Times New Roman" w:hAnsi="Times New Roman" w:cs="Times New Roman"/>
-          <w:kern w:val="0"/>
-          <w14:ligatures w14:val="none"/>
-        </w:rPr>
+      <w:r>
         <w:t>Cuando llegue el lunes con los datos nuevos, solo abre Claude y menciónale que es la actualización semanal — con la memoria que ya tiene guardada en la carpeta, tomará el hilo desde donde quedamos hoy.</w:t>
       </w:r>
     </w:p>
+    <w:p/>
+    <w:p>
+      <w:pPr>
+        <w:pStyle w:val="font-claude-response-body"/>
+      </w:pPr>
+      <w:r>
+        <w:rPr>
+          <w:rStyle w:val="Strong"/>
+        </w:rPr>
+        <w:lastRenderedPageBreak/>
+        <w:t>Vamos a actualizar los reportes ejecutivos semanales. Los Excel ya están actualizados en la carpeta REPORTES JOCELYN. Lee el CLAUDE.md y la memoria del proyecto, extrae los datos nuevos de cada plataforma y actualiza los 6 reportes HTML. Actualiza TODOS los campos: SEM_V, SEM_P, SEM_LABELS, MES_V, MES_PEDIDOS, ALL_MOD (vasos por mes para todos los modelos), COLOR_CAP (top 10 colores × capacidad con el rango de las últimas 4 semanas), tabla resumen mensual (vasos, $ sin IVA, $/vaso, MoM%), tabla YoY (vasos 2025 vs 2026), KPI pills del header, y el array PLAT del global."</w:t>
+      </w:r>
+    </w:p>
+    <w:p>
+      <w:r>
+        <w:rPr>
+          <w:noProof/>
+          <w14:ligatures w14:val="standardContextual"/>
+        </w:rPr>
+        <w:pict w14:anchorId="3496901D">
+          <v:rect id="_x0000_i1025" alt="" style="width:468pt;height:.05pt;mso-width-percent:0;mso-height-percent:0;mso-width-percent:0;mso-height-percent:0" o:hralign="center" o:hrstd="t" o:hr="t" fillcolor="#a0a0a0" stroked="f"/>
+        </w:pict>
+      </w:r>
+    </w:p>
+    <w:p>
+      <w:pPr>
+        <w:pStyle w:val="font-claude-response-body"/>
+      </w:pPr>
+      <w:r>
+        <w:t xml:space="preserve">La clave es mencionar explícitamente </w:t>
+      </w:r>
+      <w:r>
+        <w:rPr>
+          <w:rStyle w:val="Strong"/>
+        </w:rPr>
+        <w:t>ALL_MOD</w:t>
+      </w:r>
+      <w:r>
+        <w:t xml:space="preserve">, </w:t>
+      </w:r>
+      <w:r>
+        <w:rPr>
+          <w:rStyle w:val="Strong"/>
+        </w:rPr>
+        <w:t>COLOR_CAP</w:t>
+      </w:r>
+      <w:r>
+        <w:t xml:space="preserve">, </w:t>
+      </w:r>
+      <w:r>
+        <w:rPr>
+          <w:rStyle w:val="Strong"/>
+        </w:rPr>
+        <w:t>tabla YoY</w:t>
+      </w:r>
+      <w:r>
+        <w:t xml:space="preserve"> y </w:t>
+      </w:r>
+      <w:r>
+        <w:rPr>
+          <w:rStyle w:val="Strong"/>
+        </w:rPr>
+        <w:t>KPI pills</w:t>
+      </w:r>
+      <w:r>
+        <w:t xml:space="preserve"> — que son las secciones que no se actualizaron en el primer intento de hoy porque están en partes distintas del HTML y no siempre son obvias desde los pivots principales del Excel.</w:t>
+      </w:r>
+    </w:p>
+    <w:p/>
     <w:sectPr>
       <w:pgSz w:w="12240" w:h="15840"/>
       <w:pgMar w:top="1440" w:right="1440" w:bottom="1440" w:left="1440" w:header="708" w:footer="708" w:gutter="0"/>
@@ -1485,6 +1298,15 @@
   <w:style w:type="paragraph" w:default="1" w:styleId="Normal">
     <w:name w:val="Normal"/>
     <w:qFormat/>
+    <w:rsid w:val="00801648"/>
+    <w:pPr>
+      <w:spacing w:after="0" w:line="240" w:lineRule="auto"/>
+    </w:pPr>
+    <w:rPr>
+      <w:rFonts w:ascii="Times New Roman" w:eastAsia="Times New Roman" w:hAnsi="Times New Roman" w:cs="Times New Roman"/>
+      <w:kern w:val="0"/>
+      <w14:ligatures w14:val="none"/>
+    </w:rPr>
   </w:style>
   <w:style w:type="paragraph" w:styleId="Heading1">
     <w:name w:val="heading 1"/>
@@ -1497,14 +1319,16 @@
     <w:pPr>
       <w:keepNext/>
       <w:keepLines/>
-      <w:spacing w:before="360" w:after="80"/>
+      <w:spacing w:before="360" w:after="80" w:line="278" w:lineRule="auto"/>
       <w:outlineLvl w:val="0"/>
     </w:pPr>
     <w:rPr>
       <w:rFonts w:asciiTheme="majorHAnsi" w:eastAsiaTheme="majorEastAsia" w:hAnsiTheme="majorHAnsi" w:cstheme="majorBidi"/>
       <w:color w:val="0F4761" w:themeColor="accent1" w:themeShade="BF"/>
+      <w:kern w:val="2"/>
       <w:sz w:val="40"/>
       <w:szCs w:val="40"/>
+      <w14:ligatures w14:val="standardContextual"/>
     </w:rPr>
   </w:style>
   <w:style w:type="paragraph" w:styleId="Heading2">
@@ -1520,14 +1344,16 @@
     <w:pPr>
       <w:keepNext/>
       <w:keepLines/>
-      <w:spacing w:before="160" w:after="80"/>
+      <w:spacing w:before="160" w:after="80" w:line="278" w:lineRule="auto"/>
       <w:outlineLvl w:val="1"/>
     </w:pPr>
     <w:rPr>
       <w:rFonts w:asciiTheme="majorHAnsi" w:eastAsiaTheme="majorEastAsia" w:hAnsiTheme="majorHAnsi" w:cstheme="majorBidi"/>
       <w:color w:val="0F4761" w:themeColor="accent1" w:themeShade="BF"/>
+      <w:kern w:val="2"/>
       <w:sz w:val="32"/>
       <w:szCs w:val="32"/>
+      <w14:ligatures w14:val="standardContextual"/>
     </w:rPr>
   </w:style>
   <w:style w:type="paragraph" w:styleId="Heading3">
@@ -1542,14 +1368,16 @@
     <w:pPr>
       <w:keepNext/>
       <w:keepLines/>
-      <w:spacing w:before="160" w:after="80"/>
+      <w:spacing w:before="160" w:after="80" w:line="278" w:lineRule="auto"/>
       <w:outlineLvl w:val="2"/>
     </w:pPr>
     <w:rPr>
-      <w:rFonts w:eastAsiaTheme="majorEastAsia" w:cstheme="majorBidi"/>
+      <w:rFonts w:asciiTheme="minorHAnsi" w:eastAsiaTheme="majorEastAsia" w:hAnsiTheme="minorHAnsi" w:cstheme="majorBidi"/>
       <w:color w:val="0F4761" w:themeColor="accent1" w:themeShade="BF"/>
+      <w:kern w:val="2"/>
       <w:sz w:val="28"/>
       <w:szCs w:val="28"/>
+      <w14:ligatures w14:val="standardContextual"/>
     </w:rPr>
   </w:style>
   <w:style w:type="paragraph" w:styleId="Heading4">
@@ -1565,14 +1393,16 @@
     <w:pPr>
       <w:keepNext/>
       <w:keepLines/>
-      <w:spacing w:before="80" w:after="40"/>
+      <w:spacing w:before="80" w:after="40" w:line="278" w:lineRule="auto"/>
       <w:outlineLvl w:val="3"/>
     </w:pPr>
     <w:rPr>
-      <w:rFonts w:eastAsiaTheme="majorEastAsia" w:cstheme="majorBidi"/>
+      <w:rFonts w:asciiTheme="minorHAnsi" w:eastAsiaTheme="majorEastAsia" w:hAnsiTheme="minorHAnsi" w:cstheme="majorBidi"/>
       <w:i/>
       <w:iCs/>
       <w:color w:val="0F4761" w:themeColor="accent1" w:themeShade="BF"/>
+      <w:kern w:val="2"/>
+      <w14:ligatures w14:val="standardContextual"/>
     </w:rPr>
   </w:style>
   <w:style w:type="paragraph" w:styleId="Heading5">
@@ -1588,12 +1418,14 @@
     <w:pPr>
       <w:keepNext/>
       <w:keepLines/>
-      <w:spacing w:before="80" w:after="40"/>
+      <w:spacing w:before="80" w:after="40" w:line="278" w:lineRule="auto"/>
       <w:outlineLvl w:val="4"/>
     </w:pPr>
     <w:rPr>
-      <w:rFonts w:eastAsiaTheme="majorEastAsia" w:cstheme="majorBidi"/>
+      <w:rFonts w:asciiTheme="minorHAnsi" w:eastAsiaTheme="majorEastAsia" w:hAnsiTheme="minorHAnsi" w:cstheme="majorBidi"/>
       <w:color w:val="0F4761" w:themeColor="accent1" w:themeShade="BF"/>
+      <w:kern w:val="2"/>
+      <w14:ligatures w14:val="standardContextual"/>
     </w:rPr>
   </w:style>
   <w:style w:type="paragraph" w:styleId="Heading6">
@@ -1609,14 +1441,16 @@
     <w:pPr>
       <w:keepNext/>
       <w:keepLines/>
-      <w:spacing w:before="40" w:after="0"/>
+      <w:spacing w:before="40" w:line="278" w:lineRule="auto"/>
       <w:outlineLvl w:val="5"/>
     </w:pPr>
     <w:rPr>
-      <w:rFonts w:eastAsiaTheme="majorEastAsia" w:cstheme="majorBidi"/>
+      <w:rFonts w:asciiTheme="minorHAnsi" w:eastAsiaTheme="majorEastAsia" w:hAnsiTheme="minorHAnsi" w:cstheme="majorBidi"/>
       <w:i/>
       <w:iCs/>
       <w:color w:val="595959" w:themeColor="text1" w:themeTint="A6"/>
+      <w:kern w:val="2"/>
+      <w14:ligatures w14:val="standardContextual"/>
     </w:rPr>
   </w:style>
   <w:style w:type="paragraph" w:styleId="Heading7">
@@ -1632,12 +1466,14 @@
     <w:pPr>
       <w:keepNext/>
       <w:keepLines/>
-      <w:spacing w:before="40" w:after="0"/>
+      <w:spacing w:before="40" w:line="278" w:lineRule="auto"/>
       <w:outlineLvl w:val="6"/>
     </w:pPr>
     <w:rPr>
-      <w:rFonts w:eastAsiaTheme="majorEastAsia" w:cstheme="majorBidi"/>
+      <w:rFonts w:asciiTheme="minorHAnsi" w:eastAsiaTheme="majorEastAsia" w:hAnsiTheme="minorHAnsi" w:cstheme="majorBidi"/>
       <w:color w:val="595959" w:themeColor="text1" w:themeTint="A6"/>
+      <w:kern w:val="2"/>
+      <w14:ligatures w14:val="standardContextual"/>
     </w:rPr>
   </w:style>
   <w:style w:type="paragraph" w:styleId="Heading8">
@@ -1653,14 +1489,16 @@
     <w:pPr>
       <w:keepNext/>
       <w:keepLines/>
-      <w:spacing w:after="0"/>
+      <w:spacing w:line="278" w:lineRule="auto"/>
       <w:outlineLvl w:val="7"/>
     </w:pPr>
     <w:rPr>
-      <w:rFonts w:eastAsiaTheme="majorEastAsia" w:cstheme="majorBidi"/>
+      <w:rFonts w:asciiTheme="minorHAnsi" w:eastAsiaTheme="majorEastAsia" w:hAnsiTheme="minorHAnsi" w:cstheme="majorBidi"/>
       <w:i/>
       <w:iCs/>
       <w:color w:val="272727" w:themeColor="text1" w:themeTint="D8"/>
+      <w:kern w:val="2"/>
+      <w14:ligatures w14:val="standardContextual"/>
     </w:rPr>
   </w:style>
   <w:style w:type="paragraph" w:styleId="Heading9">
@@ -1676,12 +1514,14 @@
     <w:pPr>
       <w:keepNext/>
       <w:keepLines/>
-      <w:spacing w:after="0"/>
+      <w:spacing w:line="278" w:lineRule="auto"/>
       <w:outlineLvl w:val="8"/>
     </w:pPr>
     <w:rPr>
-      <w:rFonts w:eastAsiaTheme="majorEastAsia" w:cstheme="majorBidi"/>
+      <w:rFonts w:asciiTheme="minorHAnsi" w:eastAsiaTheme="majorEastAsia" w:hAnsiTheme="minorHAnsi" w:cstheme="majorBidi"/>
       <w:color w:val="272727" w:themeColor="text1" w:themeTint="D8"/>
+      <w:kern w:val="2"/>
+      <w14:ligatures w14:val="standardContextual"/>
     </w:rPr>
   </w:style>
   <w:style w:type="character" w:default="1" w:styleId="DefaultParagraphFont">
@@ -1838,7 +1678,7 @@
     <w:qFormat/>
     <w:rsid w:val="00FE22C9"/>
     <w:pPr>
-      <w:spacing w:after="80" w:line="240" w:lineRule="auto"/>
+      <w:spacing w:after="80"/>
       <w:contextualSpacing/>
     </w:pPr>
     <w:rPr>
@@ -1847,6 +1687,7 @@
       <w:kern w:val="28"/>
       <w:sz w:val="56"/>
       <w:szCs w:val="56"/>
+      <w14:ligatures w14:val="standardContextual"/>
     </w:rPr>
   </w:style>
   <w:style w:type="character" w:customStyle="1" w:styleId="TitleChar">
@@ -1875,13 +1716,16 @@
       <w:numPr>
         <w:ilvl w:val="1"/>
       </w:numPr>
+      <w:spacing w:after="160" w:line="278" w:lineRule="auto"/>
     </w:pPr>
     <w:rPr>
-      <w:rFonts w:eastAsiaTheme="majorEastAsia" w:cstheme="majorBidi"/>
+      <w:rFonts w:asciiTheme="minorHAnsi" w:eastAsiaTheme="majorEastAsia" w:hAnsiTheme="minorHAnsi" w:cstheme="majorBidi"/>
       <w:color w:val="595959" w:themeColor="text1" w:themeTint="A6"/>
       <w:spacing w:val="15"/>
+      <w:kern w:val="2"/>
       <w:sz w:val="28"/>
       <w:szCs w:val="28"/>
+      <w14:ligatures w14:val="standardContextual"/>
     </w:rPr>
   </w:style>
   <w:style w:type="character" w:customStyle="1" w:styleId="SubtitleChar">
@@ -1907,13 +1751,16 @@
     <w:qFormat/>
     <w:rsid w:val="00FE22C9"/>
     <w:pPr>
-      <w:spacing w:before="160"/>
+      <w:spacing w:before="160" w:after="160" w:line="278" w:lineRule="auto"/>
       <w:jc w:val="center"/>
     </w:pPr>
     <w:rPr>
+      <w:rFonts w:asciiTheme="minorHAnsi" w:eastAsiaTheme="minorHAnsi" w:hAnsiTheme="minorHAnsi" w:cstheme="minorBidi"/>
       <w:i/>
       <w:iCs/>
       <w:color w:val="404040" w:themeColor="text1" w:themeTint="BF"/>
+      <w:kern w:val="2"/>
+      <w14:ligatures w14:val="standardContextual"/>
     </w:rPr>
   </w:style>
   <w:style w:type="character" w:customStyle="1" w:styleId="QuoteChar">
@@ -1935,9 +1782,15 @@
     <w:qFormat/>
     <w:rsid w:val="00FE22C9"/>
     <w:pPr>
+      <w:spacing w:after="160" w:line="278" w:lineRule="auto"/>
       <w:ind w:left="720"/>
       <w:contextualSpacing/>
     </w:pPr>
+    <w:rPr>
+      <w:rFonts w:asciiTheme="minorHAnsi" w:eastAsiaTheme="minorHAnsi" w:hAnsiTheme="minorHAnsi" w:cstheme="minorBidi"/>
+      <w:kern w:val="2"/>
+      <w14:ligatures w14:val="standardContextual"/>
+    </w:rPr>
   </w:style>
   <w:style w:type="character" w:styleId="IntenseEmphasis">
     <w:name w:val="Intense Emphasis"/>
@@ -1964,14 +1817,17 @@
         <w:top w:val="single" w:sz="4" w:space="10" w:color="0F4761" w:themeColor="accent1" w:themeShade="BF"/>
         <w:bottom w:val="single" w:sz="4" w:space="10" w:color="0F4761" w:themeColor="accent1" w:themeShade="BF"/>
       </w:pBdr>
-      <w:spacing w:before="360" w:after="360"/>
+      <w:spacing w:before="360" w:after="360" w:line="278" w:lineRule="auto"/>
       <w:ind w:left="864" w:right="864"/>
       <w:jc w:val="center"/>
     </w:pPr>
     <w:rPr>
+      <w:rFonts w:asciiTheme="minorHAnsi" w:eastAsiaTheme="minorHAnsi" w:hAnsiTheme="minorHAnsi" w:cstheme="minorBidi"/>
       <w:i/>
       <w:iCs/>
       <w:color w:val="0F4761" w:themeColor="accent1" w:themeShade="BF"/>
+      <w:kern w:val="2"/>
+      <w14:ligatures w14:val="standardContextual"/>
     </w:rPr>
   </w:style>
   <w:style w:type="character" w:customStyle="1" w:styleId="IntenseQuoteChar">
@@ -2005,13 +1861,8 @@
     <w:basedOn w:val="Normal"/>
     <w:rsid w:val="00FE22C9"/>
     <w:pPr>
-      <w:spacing w:before="100" w:beforeAutospacing="1" w:after="100" w:afterAutospacing="1" w:line="240" w:lineRule="auto"/>
+      <w:spacing w:before="100" w:beforeAutospacing="1" w:after="100" w:afterAutospacing="1"/>
     </w:pPr>
-    <w:rPr>
-      <w:rFonts w:ascii="Times New Roman" w:eastAsia="Times New Roman" w:hAnsi="Times New Roman" w:cs="Times New Roman"/>
-      <w:kern w:val="0"/>
-      <w14:ligatures w14:val="none"/>
-    </w:rPr>
   </w:style>
   <w:style w:type="character" w:styleId="Strong">
     <w:name w:val="Strong"/>
@@ -2047,6 +1898,29 @@
       <w:i/>
       <w:iCs/>
     </w:rPr>
+  </w:style>
+  <w:style w:type="character" w:customStyle="1" w:styleId="absolute">
+    <w:name w:val="absolute"/>
+    <w:basedOn w:val="DefaultParagraphFont"/>
+    <w:rsid w:val="00801648"/>
+  </w:style>
+  <w:style w:type="character" w:customStyle="1" w:styleId="inline-flex">
+    <w:name w:val="inline-flex"/>
+    <w:basedOn w:val="DefaultParagraphFont"/>
+    <w:rsid w:val="00801648"/>
+  </w:style>
+  <w:style w:type="character" w:customStyle="1" w:styleId="transition-all">
+    <w:name w:val="transition-all"/>
+    <w:basedOn w:val="DefaultParagraphFont"/>
+    <w:rsid w:val="00801648"/>
+  </w:style>
+  <w:style w:type="paragraph" w:customStyle="1" w:styleId="is-empty">
+    <w:name w:val="is-empty"/>
+    <w:basedOn w:val="Normal"/>
+    <w:rsid w:val="00801648"/>
+    <w:pPr>
+      <w:spacing w:before="100" w:beforeAutospacing="1" w:after="100" w:afterAutospacing="1"/>
+    </w:pPr>
   </w:style>
 </w:styles>
 </file>

</xml_diff>